<commit_message>
feat: add Guest Wall acquisition footer
</commit_message>
<xml_diff>
--- a/artifacts/digistaybook_WIP_v3.docx
+++ b/artifacts/digistaybook_WIP_v3.docx
@@ -115,7 +115,7 @@
           <w:rFonts w:ascii="Calibri" w:hAnsi="Calibri"/>
           <w:sz w:val="20"/>
         </w:rPr>
-        <w:t xml:space="preserve"> v3 — Guest-experience marketing position and booking-provider operational boundary </w:t>
+        <w:t xml:space="preserve"> v3 — Guest-experience marketing, booking-provider boundary and Guest Wall micro-branding </w:t>
       </w:r>
       <w:r>
         <w:rPr>
@@ -3915,6 +3915,93 @@
     </w:p>
     <w:p>
       <w:pPr>
+        <w:pStyle w:val="Heading2"/>
+      </w:pPr>
+      <w:r>
+        <w:rPr>
+          <w:b/>
+        </w:rPr>
+        <w:t>6.10 "Powered by DigiStayBook" Guest Wall Micro-Branding</w:t>
+      </w:r>
+      <w:r>
+        <w:rPr>
+          <w:rFonts w:ascii="Consolas" w:hAnsi="Consolas"/>
+          <w:b w:val="0"/>
+          <w:color w:val="5A6470"/>
+          <w:sz w:val="16"/>
+        </w:rPr>
+        <w:t xml:space="preserve">  DSB-BOP-P6-010</w:t>
+      </w:r>
+    </w:p>
+    <w:p>
+      <w:r>
+        <w:rPr>
+          <w:rFonts w:ascii="Calibri" w:hAnsi="Calibri"/>
+          <w:b/>
+        </w:rPr>
+        <w:t>Purpose:</w:t>
+      </w:r>
+      <w:r>
+        <w:rPr>
+          <w:rFonts w:ascii="Calibri" w:hAnsi="Calibri"/>
+        </w:rPr>
+        <w:t xml:space="preserve"> Turn appropriate Guest Wall exposure into a potential host-acquisition path without interrupting the guest experience. Some Guests may themselves own or manage short-term rentals, or be considering hosting; this is a commercial rationale, not a claim that a particular percentage will convert. </w:t>
+      </w:r>
+      <w:r>
+        <w:rPr>
+          <w:rFonts w:ascii="Calibri" w:hAnsi="Calibri"/>
+          <w:b/>
+        </w:rPr>
+        <w:t>Required placement and copy:</w:t>
+      </w:r>
+      <w:r>
+        <w:rPr>
+          <w:rFonts w:ascii="Calibri" w:hAnsi="Calibri"/>
+        </w:rPr>
+        <w:t xml:space="preserve"> Every live public Guest Wall, including the public demo, displays a discreet text link after the wall content and contribution controls: "Loved your stay? Powered by DigiStayBook — Create a digital guestbook for your property." </w:t>
+      </w:r>
+      <w:r>
+        <w:rPr>
+          <w:rFonts w:ascii="Calibri" w:hAnsi="Calibri"/>
+          <w:b/>
+        </w:rPr>
+        <w:t>Destination:</w:t>
+      </w:r>
+      <w:r>
+        <w:rPr>
+          <w:rFonts w:ascii="Calibri" w:hAnsi="Calibri"/>
+        </w:rPr>
+        <w:t xml:space="preserve"> The link directs to the DigiStayBook main landing page. It must use a descriptive accessible label and remain usable on mobile and desktop. </w:t>
+      </w:r>
+      <w:r>
+        <w:rPr>
+          <w:rFonts w:ascii="Calibri" w:hAnsi="Calibri"/>
+          <w:b/>
+        </w:rPr>
+        <w:t>Experience guardrail:</w:t>
+      </w:r>
+      <w:r>
+        <w:rPr>
+          <w:rFonts w:ascii="Calibri" w:hAnsi="Calibri"/>
+        </w:rPr>
+        <w:t xml:space="preserve"> The micro-branding must remain visually secondary to the property's identity and Guest Wall content. It must not appear as a popup, interstitial, modal, forced redirect or contribution requirement, and it must not obscure host content or guest controls. </w:t>
+      </w:r>
+      <w:r>
+        <w:rPr>
+          <w:rFonts w:ascii="Calibri" w:hAnsi="Calibri"/>
+          <w:b/>
+        </w:rPr>
+        <w:t>Marketing boundary:</w:t>
+      </w:r>
+      <w:r>
+        <w:rPr>
+          <w:rFonts w:ascii="Calibri" w:hAnsi="Calibri"/>
+        </w:rPr>
+        <w:t xml:space="preserve"> Advertising may describe this placement as a product-discovery or host-acquisition loop. DigiStayBook must not publish an unsubstantiated conversion percentage or guarantee that Guest Wall visitors will become Host customers.</w:t>
+      </w:r>
+    </w:p>
+    <w:p>
+      <w:pPr>
         <w:pStyle w:val="Heading1"/>
       </w:pPr>
       <w:r>

</xml_diff>